<commit_message>
sync: 同步 court-doc-generator 最新源码
- CasesPage: 新增编辑功能、删除二次确认、案件绑定公司/代理人
- cases.py/agents.py: 后端 PUT 更新接口
- scan_service.py: 案号正则支持 OCR 空格噪声
- AdminPage: 管理后台页面
- generator.py/test_generator.py: 核心生成逻辑更新
- .qoder/rules/: 4 个工程规范文件
- Dockerfile: 同步更新
</commit_message>
<xml_diff>
--- a/modules/court-doc-generator/templates/5.推荐信.docx
+++ b/modules/court-doc-generator/templates/5.推荐信.docx
@@ -114,20 +114,15 @@
       </w:pPr>
       <w:r>
         <w:rPr>
-          <w:rFonts w:hint="eastAsia" w:ascii="仿宋" w:hAnsi="仿宋" w:eastAsia="仿宋" w:cs="仿宋"/>
-          <w:sz w:val="28"/>
-          <w:szCs w:val="28"/>
-          <w:lang w:val="en-US" w:eastAsia="zh-CN"/>
+          <w:b w:val="0"/>
         </w:rPr>
         <w:t>【】</w:t>
       </w:r>
       <w:r>
         <w:rPr>
-          <w:rFonts w:hint="eastAsia" w:ascii="仿宋" w:hAnsi="仿宋" w:eastAsia="仿宋" w:cs="仿宋"/>
-          <w:sz w:val="28"/>
-          <w:szCs w:val="28"/>
-        </w:rPr>
-        <w:t>人民法院：</w:t>
+          <w:b w:val="0"/>
+        </w:rPr>
+        <w:t>：</w:t>
       </w:r>
     </w:p>
     <w:p>
@@ -387,14 +382,7 @@
           <w:szCs w:val="28"/>
         </w:rPr>
       </w:pPr>
-      <w:r>
-        <w:rPr>
-          <w:rFonts w:hint="eastAsia" w:ascii="仿宋" w:hAnsi="仿宋" w:eastAsia="仿宋" w:cs="仿宋"/>
-          <w:sz w:val="28"/>
-          <w:szCs w:val="28"/>
-        </w:rPr>
-        <w:t>北京雷石天地电子技术股份有限公司</w:t>
-      </w:r>
+      <w:r/>
     </w:p>
     <w:p>
       <w:pPr>
@@ -497,6 +485,12 @@
           <w:szCs w:val="28"/>
         </w:rPr>
       </w:pPr>
+      <w:r>
+        <w:rPr>
+          <w:sz w:val="24"/>
+        </w:rPr>
+        <w:t>【】</w:t>
+      </w:r>
     </w:p>
     <w:p>
       <w:pPr>

</xml_diff>